<commit_message>
alterações de correção nos templates e alguns json
</commit_message>
<xml_diff>
--- a/templates/CONTEMPORANEA_Artigo_Original.docx
+++ b/templates/CONTEMPORANEA_Artigo_Original.docx
@@ -29,14 +29,10 @@
           <w:color w:val="646464"/>
           <w:sz w:val="18"/>
         </w:rPr>
-        <w:t>💡 Substitua pelo título do seu manuscrito</w:t>
+        <w:t>💡 ATENÇÃO: Para avaliação cega, este arquivo não deve conter qualquer identificação de autoria (nome, ORCID, afiliação, e-mail). Estas informações devem ser preenchidas apenas nos metadados do sistema de submissão online.</w:t>
       </w:r>
     </w:p>
-    <w:p>
-      <w:r>
-        <w:t>[INSIRA O TÍTULO COMPLETO, CONFORME NORMAS DA REVISTA]</w:t>
-      </w:r>
-    </w:p>
+    <w:p/>
     <w:p>
       <w:pPr>
         <w:shd w:val="clear" w:color="auto" w:fill="FFF2CC"/>
@@ -50,33 +46,12 @@
           <w:color w:val="646464"/>
           <w:sz w:val="18"/>
         </w:rPr>
-        <w:t>💡 Liste todos os autores com suas respectivas informações (ORCID, afiliação)</w:t>
+        <w:t>💡 Substitua pelo título do seu manuscrito</w:t>
       </w:r>
     </w:p>
     <w:p>
       <w:r>
-        <w:t>[NOME COMPLETO DOS AUTORES, ORCID, AFILIAÇÃO INSTITUCIONAL]</w:t>
-      </w:r>
-    </w:p>
-    <w:p>
-      <w:pPr>
-        <w:shd w:val="clear" w:color="auto" w:fill="FFF2CC"/>
-        <w:pBdr>
-          <w:bottom w:val="single" w:sz="4" w:space="4" w:color="FF914D"/>
-        </w:pBdr>
-      </w:pPr>
-      <w:r>
-        <w:rPr>
-          <w:i/>
-          <w:color w:val="646464"/>
-          <w:sz w:val="18"/>
-        </w:rPr>
-        <w:t>💡 Indique o endereço eletrônico principal para correspondência</w:t>
-      </w:r>
-    </w:p>
-    <w:p>
-      <w:r>
-        <w:t>[E-MAIL DO AUTOR PARA CORRESPONDÊNCIA]</w:t>
+        <w:t>[INSIRA O TÍTULO COMPLETO, CONFORME NORMAS DA REVISTA]</w:t>
       </w:r>
     </w:p>
     <w:p/>
@@ -448,7 +423,7 @@
     </w:p>
     <w:p>
       <w:r>
-        <w:t xml:space="preserve">⚠️ Recuo:  | Fonte: 11 pt | Espaçamento: </w:t>
+        <w:t>⚠️ Recuo: 4 cm | Fonte: 11 pt | Espaçamento: simples</w:t>
       </w:r>
     </w:p>
     <w:p>

</xml_diff>